<commit_message>
chore(dastur): regenerate oquv_dastur.docx with the Seminar column
Output of scripts/make_dastur_template.py after add_seminar_column().
</commit_message>
<xml_diff>
--- a/plans/dastur/oquv_dastur.docx
+++ b/plans/dastur/oquv_dastur.docx
@@ -821,7 +821,8 @@
         <w:gridCol w:w="1580"/>
         <w:gridCol w:w="1104"/>
         <w:gridCol w:w="1080"/>
-        <w:gridCol w:w="1080"/>
+        <w:gridCol w:w="720"/>
+        <w:gridCol w:w="360"/>
         <w:gridCol w:w="1980"/>
         <w:gridCol w:w="331"/>
         <w:gridCol w:w="695"/>
@@ -861,7 +862,7 @@
         <w:tc>
           <w:tcPr>
             <w:tcW w:w="9062" w:type="dxa"/>
-            <w:gridSpan w:val="8"/>
+            <w:gridSpan w:val="9"/>
             <w:vAlign w:val="center"/>
           </w:tcPr>
           <w:p>
@@ -993,7 +994,7 @@
         </w:tc>
         <w:tc>
           <w:tcPr>
-            <w:tcW w:w="3264" w:type="dxa"/>
+            <w:tcW w:w="2904" w:type="dxa"/>
             <w:gridSpan w:val="3"/>
             <w:shd w:val="clear" w:color="auto" w:fill="D9D9D9"/>
             <w:vAlign w:val="center"/>
@@ -1033,8 +1034,8 @@
         </w:tc>
         <w:tc>
           <w:tcPr>
-            <w:tcW w:w="3006" w:type="dxa"/>
-            <w:gridSpan w:val="3"/>
+            <w:tcW w:w="3366" w:type="dxa"/>
+            <w:gridSpan w:val="4"/>
             <w:shd w:val="clear" w:color="auto" w:fill="D9D9D9"/>
             <w:vAlign w:val="center"/>
           </w:tcPr>
@@ -1174,7 +1175,7 @@
         </w:tc>
         <w:tc>
           <w:tcPr>
-            <w:tcW w:w="3264" w:type="dxa"/>
+            <w:tcW w:w="2904" w:type="dxa"/>
             <w:gridSpan w:val="3"/>
             <w:tcBorders>
               <w:bottom w:val="single" w:sz="4" w:space="0" w:color="auto"/>
@@ -1244,8 +1245,8 @@
         </w:tc>
         <w:tc>
           <w:tcPr>
-            <w:tcW w:w="3006" w:type="dxa"/>
-            <w:gridSpan w:val="3"/>
+            <w:tcW w:w="3366" w:type="dxa"/>
+            <w:gridSpan w:val="4"/>
             <w:tcBorders>
               <w:bottom w:val="single" w:sz="4" w:space="0" w:color="auto"/>
             </w:tcBorders>
@@ -1372,7 +1373,7 @@
         <w:tc>
           <w:tcPr>
             <w:tcW w:w="3264" w:type="dxa"/>
-            <w:gridSpan w:val="3"/>
+            <w:gridSpan w:val="4"/>
             <w:shd w:val="clear" w:color="auto" w:fill="D9D9D9"/>
             <w:vAlign w:val="center"/>
           </w:tcPr>
@@ -1565,7 +1566,7 @@
         </w:tc>
         <w:tc>
           <w:tcPr>
-            <w:tcW w:w="1080" w:type="dxa"/>
+            <w:tcW w:w="720" w:type="dxa"/>
             <w:shd w:val="clear" w:color="auto" w:fill="D9D9D9"/>
             <w:vAlign w:val="center"/>
           </w:tcPr>
@@ -1586,6 +1587,27 @@
                 <w:lang w:val="en-US"/>
               </w:rPr>
               <w:t>Lab-ya</w:t>
+            </w:r>
+          </w:p>
+        </w:tc>
+        <w:tc>
+          <w:tcPr>
+            <w:tcW w:w="360" w:type="dxa"/>
+            <w:shd w:val="clear" w:color="auto" w:fill="D9D9D9"/>
+            <w:vAlign w:val="center"/>
+          </w:tcPr>
+          <w:p>
+            <w:pPr>
+              <w:spacing w:line="276" w:lineRule="auto"/>
+              <w:jc w:val="center"/>
+              <w:rPr>
+                <w:b/>
+                <w:sz w:val="28"/>
+                <w:lang w:val="en-US"/>
+              </w:rPr>
+            </w:pPr>
+            <w:r>
+              <w:t>Seminar</w:t>
             </w:r>
           </w:p>
         </w:tc>
@@ -1728,7 +1750,7 @@
         </w:tc>
         <w:tc>
           <w:tcPr>
-            <w:tcW w:w="1080" w:type="dxa"/>
+            <w:tcW w:w="720" w:type="dxa"/>
             <w:tcBorders>
               <w:bottom w:val="single" w:sz="4" w:space="0" w:color="auto"/>
             </w:tcBorders>
@@ -1749,6 +1771,28 @@
                 <w:lang w:val="en-US"/>
               </w:rPr>
               <w:t>{{ hours.lab }}</w:t>
+            </w:r>
+          </w:p>
+        </w:tc>
+        <w:tc>
+          <w:tcPr>
+            <w:tcW w:w="360" w:type="dxa"/>
+            <w:tcBorders>
+              <w:bottom w:val="single" w:sz="4" w:space="0" w:color="auto"/>
+            </w:tcBorders>
+            <w:vAlign w:val="center"/>
+          </w:tcPr>
+          <w:p>
+            <w:pPr>
+              <w:spacing w:line="276" w:lineRule="auto"/>
+              <w:jc w:val="center"/>
+              <w:rPr>
+                <w:sz w:val="28"/>
+                <w:lang w:val="en-US"/>
+              </w:rPr>
+            </w:pPr>
+            <w:r>
+              <w:t>{{ hours.seminar }}</w:t>
             </w:r>
           </w:p>
         </w:tc>
@@ -1835,7 +1879,7 @@
         <w:tc>
           <w:tcPr>
             <w:tcW w:w="9062" w:type="dxa"/>
-            <w:gridSpan w:val="8"/>
+            <w:gridSpan w:val="9"/>
             <w:tcBorders>
               <w:top w:val="single" w:sz="4" w:space="0" w:color="auto"/>
               <w:left w:val="nil"/>
@@ -1895,7 +1939,7 @@
         <w:tc>
           <w:tcPr>
             <w:tcW w:w="9062" w:type="dxa"/>
-            <w:gridSpan w:val="8"/>
+            <w:gridSpan w:val="9"/>
             <w:tcBorders>
               <w:top w:val="single" w:sz="4" w:space="0" w:color="auto"/>
             </w:tcBorders>
@@ -1928,7 +1972,7 @@
         <w:tc>
           <w:tcPr>
             <w:tcW w:w="9961" w:type="dxa"/>
-            <w:gridSpan w:val="10"/>
+            <w:gridSpan w:val="11"/>
             <w:tcBorders>
               <w:bottom w:val="single" w:sz="4" w:space="0" w:color="auto"/>
             </w:tcBorders>
@@ -1974,6 +2018,298 @@
         <w:tc>
           <w:tcPr>
             <w:tcW w:w="9961" w:type="dxa"/>
+            <w:gridSpan w:val="11"/>
+            <w:tcBorders>
+              <w:top w:val="single" w:sz="4" w:space="0" w:color="auto"/>
+              <w:left w:val="nil"/>
+              <w:bottom w:val="single" w:sz="4" w:space="0" w:color="auto"/>
+              <w:right w:val="nil"/>
+            </w:tcBorders>
+          </w:tcPr>
+          <w:p>
+            <w:pPr>
+              <w:spacing w:line="276" w:lineRule="auto"/>
+              <w:jc w:val="both"/>
+              <w:rPr>
+                <w:sz w:val="16"/>
+                <w:szCs w:val="16"/>
+              </w:rPr>
+            </w:pPr>
+          </w:p>
+        </w:tc>
+      </w:tr>
+      <w:tr>
+        <w:trPr>
+          <w:trHeight w:val="435"/>
+        </w:trPr>
+        <w:tc>
+          <w:tcPr>
+            <w:tcW w:w="715" w:type="dxa"/>
+            <w:tcBorders>
+              <w:top w:val="single" w:sz="4" w:space="0" w:color="auto"/>
+              <w:bottom w:val="single" w:sz="4" w:space="0" w:color="auto"/>
+            </w:tcBorders>
+            <w:vAlign w:val="center"/>
+          </w:tcPr>
+          <w:p>
+            <w:pPr>
+              <w:spacing w:after="20"/>
+              <w:ind w:right="146"/>
+              <w:jc w:val="center"/>
+              <w:rPr>
+                <w:b/>
+                <w:bCs/>
+                <w:sz w:val="28"/>
+                <w:szCs w:val="28"/>
+                <w:lang w:val="en-US"/>
+              </w:rPr>
+            </w:pPr>
+            <w:r>
+              <w:rPr>
+                <w:b/>
+                <w:bCs/>
+                <w:sz w:val="28"/>
+                <w:szCs w:val="28"/>
+                <w:lang w:val="en-US"/>
+              </w:rPr>
+              <w:t>3.</w:t>
+            </w:r>
+          </w:p>
+        </w:tc>
+        <w:tc>
+          <w:tcPr>
+            <w:tcW w:w="9246" w:type="dxa"/>
+            <w:gridSpan w:val="10"/>
+            <w:tcBorders>
+              <w:top w:val="single" w:sz="4" w:space="0" w:color="auto"/>
+              <w:bottom w:val="single" w:sz="4" w:space="0" w:color="auto"/>
+            </w:tcBorders>
+            <w:vAlign w:val="center"/>
+          </w:tcPr>
+          <w:p>
+            <w:pPr>
+              <w:spacing w:after="20"/>
+              <w:ind w:left="79" w:right="146"/>
+              <w:rPr>
+                <w:b/>
+                <w:bCs/>
+                <w:sz w:val="28"/>
+                <w:szCs w:val="28"/>
+                <w:lang w:val="en-US"/>
+              </w:rPr>
+            </w:pPr>
+            <w:r>
+              <w:rPr>
+                <w:b/>
+                <w:bCs/>
+                <w:sz w:val="28"/>
+                <w:szCs w:val="28"/>
+                <w:lang w:val="en-US"/>
+              </w:rPr>
+              <w:t>Fanni o‘zlashtirish uchun zarur boshlang‘ich bilimlar</w:t>
+            </w:r>
+          </w:p>
+        </w:tc>
+      </w:tr>
+      <w:tr>
+        <w:tc>
+          <w:tcPr>
+            <w:tcW w:w="715" w:type="dxa"/>
+            <w:vAlign w:val="center"/>
+          </w:tcPr>
+          <w:p>
+            <w:pPr>
+              <w:spacing w:after="20"/>
+              <w:ind w:right="146"/>
+              <w:jc w:val="center"/>
+              <w:rPr>
+                <w:b/>
+                <w:bCs/>
+                <w:sz w:val="28"/>
+                <w:szCs w:val="28"/>
+                <w:lang w:val="en-US"/>
+              </w:rPr>
+            </w:pPr>
+            <w:r>
+              <w:rPr>
+                <w:sz w:val="28"/>
+                <w:szCs w:val="28"/>
+                <w:lang w:val="en-US"/>
+              </w:rPr>
+              <w:t>{%tr for item in prerequisites %}</w:t>
+            </w:r>
+          </w:p>
+        </w:tc>
+        <w:tc>
+          <w:tcPr>
+            <w:tcW w:w="9246" w:type="dxa"/>
+            <w:gridSpan w:val="10"/>
+            <w:vAlign w:val="center"/>
+          </w:tcPr>
+          <w:p>
+            <w:pPr>
+              <w:spacing w:after="20"/>
+              <w:ind w:left="121" w:right="146"/>
+              <w:rPr>
+                <w:sz w:val="28"/>
+                <w:szCs w:val="28"/>
+                <w:lang w:val="en-US"/>
+              </w:rPr>
+            </w:pPr>
+            <w:r>
+              <w:rPr>
+                <w:sz w:val="28"/>
+                <w:szCs w:val="28"/>
+                <w:lang w:val="en-US"/>
+              </w:rPr>
+            </w:r>
+          </w:p>
+        </w:tc>
+      </w:tr>
+      <w:tr>
+        <w:tc>
+          <w:tcPr>
+            <w:tcW w:w="715" w:type="dxa"/>
+            <w:vAlign w:val="center"/>
+          </w:tcPr>
+          <w:p>
+            <w:pPr>
+              <w:spacing w:after="20"/>
+              <w:ind w:right="146"/>
+              <w:jc w:val="center"/>
+              <w:rPr>
+                <w:b/>
+                <w:bCs/>
+                <w:sz w:val="28"/>
+                <w:szCs w:val="28"/>
+                <w:lang w:val="en-US"/>
+              </w:rPr>
+            </w:pPr>
+            <w:r>
+              <w:rPr>
+                <w:sz w:val="28"/>
+                <w:szCs w:val="28"/>
+                <w:lang w:val="en-US"/>
+              </w:rPr>
+              <w:t>{{ loop.index }}.</w:t>
+            </w:r>
+          </w:p>
+        </w:tc>
+        <w:tc>
+          <w:tcPr>
+            <w:tcW w:w="9246" w:type="dxa"/>
+            <w:gridSpan w:val="10"/>
+            <w:vAlign w:val="center"/>
+          </w:tcPr>
+          <w:p>
+            <w:pPr>
+              <w:spacing w:after="20"/>
+              <w:ind w:left="121" w:right="146"/>
+              <w:rPr>
+                <w:sz w:val="28"/>
+                <w:szCs w:val="28"/>
+                <w:lang w:val="en-US"/>
+              </w:rPr>
+            </w:pPr>
+            <w:r>
+              <w:rPr>
+                <w:sz w:val="28"/>
+                <w:szCs w:val="28"/>
+                <w:lang w:val="en-US"/>
+              </w:rPr>
+              <w:t>{{ item }}</w:t>
+            </w:r>
+          </w:p>
+        </w:tc>
+      </w:tr>
+      <w:tr>
+        <w:tc>
+          <w:tcPr>
+            <w:tcW w:w="715" w:type="dxa"/>
+            <w:vAlign w:val="center"/>
+          </w:tcPr>
+          <w:p>
+            <w:pPr>
+              <w:spacing w:after="20"/>
+              <w:ind w:right="146"/>
+              <w:jc w:val="center"/>
+              <w:rPr>
+                <w:b/>
+                <w:bCs/>
+                <w:sz w:val="28"/>
+                <w:szCs w:val="28"/>
+                <w:lang w:val="en-US"/>
+              </w:rPr>
+            </w:pPr>
+            <w:r>
+              <w:rPr>
+                <w:sz w:val="28"/>
+                <w:szCs w:val="28"/>
+                <w:lang w:val="en-US"/>
+              </w:rPr>
+              <w:t>{%tr endfor %}</w:t>
+            </w:r>
+          </w:p>
+        </w:tc>
+        <w:tc>
+          <w:tcPr>
+            <w:tcW w:w="9246" w:type="dxa"/>
+            <w:gridSpan w:val="10"/>
+            <w:vAlign w:val="center"/>
+          </w:tcPr>
+          <w:p>
+            <w:pPr>
+              <w:spacing w:after="20"/>
+              <w:ind w:left="121" w:right="146"/>
+              <w:rPr>
+                <w:sz w:val="28"/>
+                <w:szCs w:val="28"/>
+                <w:lang w:val="en-US"/>
+              </w:rPr>
+            </w:pPr>
+            <w:r>
+              <w:rPr>
+                <w:sz w:val="28"/>
+                <w:szCs w:val="28"/>
+                <w:lang w:val="en-US"/>
+              </w:rPr>
+            </w:r>
+          </w:p>
+        </w:tc>
+      </w:tr>
+      <w:tr>
+        <w:trPr>
+          <w:trHeight w:val="207"/>
+        </w:trPr>
+        <w:tc>
+          <w:tcPr>
+            <w:tcW w:w="715" w:type="dxa"/>
+            <w:tcBorders>
+              <w:top w:val="single" w:sz="4" w:space="0" w:color="auto"/>
+              <w:left w:val="nil"/>
+              <w:bottom w:val="single" w:sz="4" w:space="0" w:color="auto"/>
+              <w:right w:val="nil"/>
+            </w:tcBorders>
+            <w:vAlign w:val="center"/>
+          </w:tcPr>
+          <w:p>
+            <w:pPr>
+              <w:spacing w:after="20"/>
+              <w:ind w:right="146"/>
+              <w:jc w:val="center"/>
+              <w:rPr>
+                <w:b/>
+                <w:bCs/>
+                <w:sz w:val="16"/>
+                <w:szCs w:val="16"/>
+                <w:lang w:val="en-US"/>
+              </w:rPr>
+            </w:pPr>
+          </w:p>
+        </w:tc>
+        <w:tc>
+          <w:tcPr>
+            <w:tcW w:w="9246" w:type="dxa"/>
             <w:gridSpan w:val="10"/>
             <w:tcBorders>
               <w:top w:val="single" w:sz="4" w:space="0" w:color="auto"/>
@@ -1981,12 +2317,15 @@
               <w:bottom w:val="single" w:sz="4" w:space="0" w:color="auto"/>
               <w:right w:val="nil"/>
             </w:tcBorders>
-          </w:tcPr>
-          <w:p>
-            <w:pPr>
-              <w:spacing w:line="276" w:lineRule="auto"/>
-              <w:jc w:val="both"/>
-              <w:rPr>
+            <w:vAlign w:val="center"/>
+          </w:tcPr>
+          <w:p>
+            <w:pPr>
+              <w:spacing w:after="20"/>
+              <w:ind w:left="79" w:right="146"/>
+              <w:rPr>
+                <w:b/>
+                <w:bCs/>
                 <w:sz w:val="16"/>
                 <w:szCs w:val="16"/>
               </w:rPr>
@@ -1996,14 +2335,13 @@
       </w:tr>
       <w:tr>
         <w:trPr>
-          <w:trHeight w:val="435"/>
+          <w:trHeight w:val="353"/>
         </w:trPr>
         <w:tc>
           <w:tcPr>
             <w:tcW w:w="715" w:type="dxa"/>
             <w:tcBorders>
               <w:top w:val="single" w:sz="4" w:space="0" w:color="auto"/>
-              <w:bottom w:val="single" w:sz="4" w:space="0" w:color="auto"/>
             </w:tcBorders>
             <w:vAlign w:val="center"/>
           </w:tcPr>
@@ -2013,32 +2351,37 @@
               <w:ind w:right="146"/>
               <w:jc w:val="center"/>
               <w:rPr>
-                <w:b/>
-                <w:bCs/>
-                <w:sz w:val="28"/>
-                <w:szCs w:val="28"/>
-                <w:lang w:val="en-US"/>
-              </w:rPr>
-            </w:pPr>
-            <w:r>
-              <w:rPr>
-                <w:b/>
-                <w:bCs/>
-                <w:sz w:val="28"/>
-                <w:szCs w:val="28"/>
-                <w:lang w:val="en-US"/>
-              </w:rPr>
-              <w:t>3.</w:t>
+                <w:sz w:val="28"/>
+                <w:szCs w:val="28"/>
+              </w:rPr>
+            </w:pPr>
+            <w:r>
+              <w:rPr>
+                <w:b/>
+                <w:bCs/>
+                <w:sz w:val="28"/>
+                <w:szCs w:val="28"/>
+                <w:lang w:val="en-US"/>
+              </w:rPr>
+              <w:t>4</w:t>
+            </w:r>
+            <w:r>
+              <w:rPr>
+                <w:b/>
+                <w:bCs/>
+                <w:sz w:val="28"/>
+                <w:szCs w:val="28"/>
+              </w:rPr>
+              <w:t>.</w:t>
             </w:r>
           </w:p>
         </w:tc>
         <w:tc>
           <w:tcPr>
             <w:tcW w:w="9246" w:type="dxa"/>
-            <w:gridSpan w:val="9"/>
+            <w:gridSpan w:val="10"/>
             <w:tcBorders>
               <w:top w:val="single" w:sz="4" w:space="0" w:color="auto"/>
-              <w:bottom w:val="single" w:sz="4" w:space="0" w:color="auto"/>
             </w:tcBorders>
             <w:vAlign w:val="center"/>
           </w:tcPr>
@@ -2047,22 +2390,35 @@
               <w:spacing w:after="20"/>
               <w:ind w:left="79" w:right="146"/>
               <w:rPr>
-                <w:b/>
-                <w:bCs/>
-                <w:sz w:val="28"/>
-                <w:szCs w:val="28"/>
-                <w:lang w:val="en-US"/>
-              </w:rPr>
-            </w:pPr>
-            <w:r>
-              <w:rPr>
-                <w:b/>
-                <w:bCs/>
-                <w:sz w:val="28"/>
-                <w:szCs w:val="28"/>
-                <w:lang w:val="en-US"/>
-              </w:rPr>
-              <w:t>Fanni o‘zlashtirish uchun zarur boshlang‘ich bilimlar</w:t>
+                <w:sz w:val="28"/>
+                <w:szCs w:val="28"/>
+              </w:rPr>
+            </w:pPr>
+            <w:r>
+              <w:rPr>
+                <w:b/>
+                <w:bCs/>
+                <w:sz w:val="28"/>
+                <w:szCs w:val="28"/>
+              </w:rPr>
+              <w:t>Ta</w:t>
+            </w:r>
+            <w:r>
+              <w:rPr>
+                <w:b/>
+                <w:sz w:val="28"/>
+                <w:lang w:val="en-US"/>
+              </w:rPr>
+              <w:t>’</w:t>
+            </w:r>
+            <w:r>
+              <w:rPr>
+                <w:b/>
+                <w:bCs/>
+                <w:sz w:val="28"/>
+                <w:szCs w:val="28"/>
+              </w:rPr>
+              <w:t>lim natijalari (TN)</w:t>
             </w:r>
           </w:p>
         </w:tc>
@@ -2077,47 +2433,36 @@
             <w:pPr>
               <w:spacing w:after="20"/>
               <w:ind w:right="146"/>
-              <w:jc w:val="center"/>
-              <w:rPr>
-                <w:b/>
-                <w:bCs/>
-                <w:sz w:val="28"/>
-                <w:szCs w:val="28"/>
-                <w:lang w:val="en-US"/>
-              </w:rPr>
-            </w:pPr>
-            <w:r>
-              <w:rPr>
-                <w:sz w:val="28"/>
-                <w:szCs w:val="28"/>
-                <w:lang w:val="en-US"/>
-              </w:rPr>
-              <w:t>{%tr for item in prerequisites %}</w:t>
-            </w:r>
+              <w:rPr>
+                <w:sz w:val="28"/>
+                <w:szCs w:val="28"/>
+              </w:rPr>
+            </w:pPr>
           </w:p>
         </w:tc>
         <w:tc>
           <w:tcPr>
             <w:tcW w:w="9246" w:type="dxa"/>
-            <w:gridSpan w:val="9"/>
-            <w:vAlign w:val="center"/>
-          </w:tcPr>
-          <w:p>
-            <w:pPr>
-              <w:spacing w:after="20"/>
+            <w:gridSpan w:val="10"/>
+          </w:tcPr>
+          <w:p>
+            <w:pPr>
               <w:ind w:left="121" w:right="146"/>
               <w:rPr>
                 <w:sz w:val="28"/>
                 <w:szCs w:val="28"/>
-                <w:lang w:val="en-US"/>
-              </w:rPr>
-            </w:pPr>
-            <w:r>
-              <w:rPr>
-                <w:sz w:val="28"/>
-                <w:szCs w:val="28"/>
-                <w:lang w:val="en-US"/>
-              </w:rPr>
+              </w:rPr>
+            </w:pPr>
+            <w:r>
+              <w:rPr>
+                <w:b/>
+                <w:bCs/>
+                <w:i/>
+                <w:iCs/>
+                <w:sz w:val="28"/>
+                <w:szCs w:val="28"/>
+              </w:rPr>
+              <w:t>Kasbiy kompetensiyalar:</w:t>
             </w:r>
           </w:p>
         </w:tc>
@@ -2131,49 +2476,43 @@
           <w:p>
             <w:pPr>
               <w:spacing w:after="20"/>
-              <w:ind w:right="146"/>
-              <w:jc w:val="center"/>
-              <w:rPr>
-                <w:b/>
-                <w:bCs/>
-                <w:sz w:val="28"/>
-                <w:szCs w:val="28"/>
-                <w:lang w:val="en-US"/>
-              </w:rPr>
-            </w:pPr>
-            <w:r>
-              <w:rPr>
-                <w:sz w:val="28"/>
-                <w:szCs w:val="28"/>
-                <w:lang w:val="en-US"/>
-              </w:rPr>
-              <w:t>{{ loop.index }}.</w:t>
+              <w:ind w:right="1"/>
+              <w:jc w:val="center"/>
+              <w:rPr>
+                <w:sz w:val="28"/>
+                <w:szCs w:val="28"/>
+              </w:rPr>
+            </w:pPr>
+            <w:r>
+              <w:rPr>
+                <w:bCs/>
+                <w:sz w:val="28"/>
+                <w:szCs w:val="28"/>
+              </w:rPr>
+              <w:t>{%tr for o in outcomes.professional %}</w:t>
             </w:r>
           </w:p>
         </w:tc>
         <w:tc>
           <w:tcPr>
             <w:tcW w:w="9246" w:type="dxa"/>
-            <w:gridSpan w:val="9"/>
-            <w:vAlign w:val="center"/>
-          </w:tcPr>
-          <w:p>
-            <w:pPr>
-              <w:spacing w:after="20"/>
-              <w:ind w:left="121" w:right="146"/>
-              <w:rPr>
-                <w:sz w:val="28"/>
-                <w:szCs w:val="28"/>
-                <w:lang w:val="en-US"/>
-              </w:rPr>
-            </w:pPr>
-            <w:r>
-              <w:rPr>
-                <w:sz w:val="28"/>
-                <w:szCs w:val="28"/>
-                <w:lang w:val="en-US"/>
-              </w:rPr>
-              <w:t>{{ item }}</w:t>
+            <w:gridSpan w:val="10"/>
+            <w:vAlign w:val="center"/>
+          </w:tcPr>
+          <w:p>
+            <w:pPr>
+              <w:spacing w:after="20" w:line="276" w:lineRule="auto"/>
+              <w:ind w:right="146"/>
+              <w:jc w:val="both"/>
+              <w:rPr>
+                <w:sz w:val="28"/>
+                <w:szCs w:val="28"/>
+              </w:rPr>
+            </w:pPr>
+            <w:r>
+              <w:rPr>
+                <w:sz w:val="28"/>
+              </w:rPr>
             </w:r>
           </w:p>
         </w:tc>
@@ -2187,21 +2526,69 @@
           <w:p>
             <w:pPr>
               <w:spacing w:after="20"/>
-              <w:ind w:right="146"/>
-              <w:jc w:val="center"/>
-              <w:rPr>
-                <w:b/>
-                <w:bCs/>
-                <w:sz w:val="28"/>
-                <w:szCs w:val="28"/>
-                <w:lang w:val="en-US"/>
-              </w:rPr>
-            </w:pPr>
-            <w:r>
-              <w:rPr>
-                <w:sz w:val="28"/>
-                <w:szCs w:val="28"/>
-                <w:lang w:val="en-US"/>
+              <w:ind w:right="1"/>
+              <w:jc w:val="center"/>
+              <w:rPr>
+                <w:sz w:val="28"/>
+                <w:szCs w:val="28"/>
+              </w:rPr>
+            </w:pPr>
+            <w:r>
+              <w:rPr>
+                <w:bCs/>
+                <w:sz w:val="28"/>
+                <w:szCs w:val="28"/>
+              </w:rPr>
+              <w:t>{{ o.code }}</w:t>
+            </w:r>
+          </w:p>
+        </w:tc>
+        <w:tc>
+          <w:tcPr>
+            <w:tcW w:w="9246" w:type="dxa"/>
+            <w:gridSpan w:val="10"/>
+            <w:vAlign w:val="center"/>
+          </w:tcPr>
+          <w:p>
+            <w:pPr>
+              <w:spacing w:after="20" w:line="276" w:lineRule="auto"/>
+              <w:ind w:right="146"/>
+              <w:jc w:val="both"/>
+              <w:rPr>
+                <w:sz w:val="28"/>
+                <w:szCs w:val="28"/>
+              </w:rPr>
+            </w:pPr>
+            <w:r>
+              <w:rPr>
+                <w:sz w:val="28"/>
+              </w:rPr>
+              <w:t>{{ o.text }}</w:t>
+            </w:r>
+          </w:p>
+        </w:tc>
+      </w:tr>
+      <w:tr>
+        <w:tc>
+          <w:tcPr>
+            <w:tcW w:w="715" w:type="dxa"/>
+            <w:vAlign w:val="center"/>
+          </w:tcPr>
+          <w:p>
+            <w:pPr>
+              <w:spacing w:after="20"/>
+              <w:ind w:right="1"/>
+              <w:jc w:val="center"/>
+              <w:rPr>
+                <w:sz w:val="28"/>
+                <w:szCs w:val="28"/>
+              </w:rPr>
+            </w:pPr>
+            <w:r>
+              <w:rPr>
+                <w:bCs/>
+                <w:sz w:val="28"/>
+                <w:szCs w:val="28"/>
               </w:rPr>
               <w:t>{%tr endfor %}</w:t>
             </w:r>
@@ -2210,24 +2597,22 @@
         <w:tc>
           <w:tcPr>
             <w:tcW w:w="9246" w:type="dxa"/>
-            <w:gridSpan w:val="9"/>
-            <w:vAlign w:val="center"/>
-          </w:tcPr>
-          <w:p>
-            <w:pPr>
-              <w:spacing w:after="20"/>
-              <w:ind w:left="121" w:right="146"/>
-              <w:rPr>
-                <w:sz w:val="28"/>
-                <w:szCs w:val="28"/>
-                <w:lang w:val="en-US"/>
-              </w:rPr>
-            </w:pPr>
-            <w:r>
-              <w:rPr>
-                <w:sz w:val="28"/>
-                <w:szCs w:val="28"/>
-                <w:lang w:val="en-US"/>
+            <w:gridSpan w:val="10"/>
+            <w:vAlign w:val="center"/>
+          </w:tcPr>
+          <w:p>
+            <w:pPr>
+              <w:spacing w:after="20" w:line="276" w:lineRule="auto"/>
+              <w:ind w:right="146"/>
+              <w:jc w:val="both"/>
+              <w:rPr>
+                <w:sz w:val="28"/>
+                <w:szCs w:val="28"/>
+              </w:rPr>
+            </w:pPr>
+            <w:r>
+              <w:rPr>
+                <w:sz w:val="28"/>
               </w:rPr>
             </w:r>
           </w:p>
@@ -2235,11 +2620,212 @@
       </w:tr>
       <w:tr>
         <w:trPr>
-          <w:trHeight w:val="207"/>
+          <w:trHeight w:val="382"/>
         </w:trPr>
         <w:tc>
           <w:tcPr>
             <w:tcW w:w="715" w:type="dxa"/>
+            <w:vAlign w:val="center"/>
+          </w:tcPr>
+          <w:p>
+            <w:pPr>
+              <w:spacing w:after="20"/>
+              <w:ind w:right="1"/>
+              <w:jc w:val="center"/>
+              <w:rPr>
+                <w:sz w:val="28"/>
+                <w:szCs w:val="28"/>
+                <w:lang w:val="en-US"/>
+              </w:rPr>
+            </w:pPr>
+          </w:p>
+        </w:tc>
+        <w:tc>
+          <w:tcPr>
+            <w:tcW w:w="9246" w:type="dxa"/>
+            <w:gridSpan w:val="10"/>
+          </w:tcPr>
+          <w:p>
+            <w:pPr>
+              <w:ind w:left="121" w:right="146"/>
+              <w:rPr>
+                <w:sz w:val="28"/>
+                <w:szCs w:val="28"/>
+              </w:rPr>
+            </w:pPr>
+            <w:r>
+              <w:rPr>
+                <w:b/>
+                <w:bCs/>
+                <w:i/>
+                <w:iCs/>
+                <w:sz w:val="28"/>
+                <w:szCs w:val="28"/>
+              </w:rPr>
+              <w:t>Ko‘nikmalar:</w:t>
+            </w:r>
+          </w:p>
+        </w:tc>
+      </w:tr>
+      <w:tr>
+        <w:tc>
+          <w:tcPr>
+            <w:tcW w:w="715" w:type="dxa"/>
+            <w:vAlign w:val="center"/>
+          </w:tcPr>
+          <w:p>
+            <w:pPr>
+              <w:spacing w:after="20"/>
+              <w:ind w:right="1"/>
+              <w:jc w:val="center"/>
+              <w:rPr>
+                <w:sz w:val="28"/>
+                <w:szCs w:val="28"/>
+                <w:lang w:val="en-US"/>
+              </w:rPr>
+            </w:pPr>
+            <w:r>
+              <w:rPr>
+                <w:bCs/>
+                <w:sz w:val="28"/>
+                <w:szCs w:val="28"/>
+              </w:rPr>
+              <w:t>{%tr for o in outcomes.skills %}</w:t>
+            </w:r>
+          </w:p>
+        </w:tc>
+        <w:tc>
+          <w:tcPr>
+            <w:tcW w:w="9246" w:type="dxa"/>
+            <w:gridSpan w:val="10"/>
+            <w:vAlign w:val="center"/>
+          </w:tcPr>
+          <w:p>
+            <w:pPr>
+              <w:spacing w:after="20" w:line="276" w:lineRule="auto"/>
+              <w:ind w:right="146"/>
+              <w:jc w:val="both"/>
+              <w:rPr>
+                <w:sz w:val="28"/>
+                <w:szCs w:val="28"/>
+              </w:rPr>
+            </w:pPr>
+            <w:r>
+              <w:rPr>
+                <w:sz w:val="28"/>
+              </w:rPr>
+            </w:r>
+          </w:p>
+        </w:tc>
+      </w:tr>
+      <w:tr>
+        <w:tc>
+          <w:tcPr>
+            <w:tcW w:w="715" w:type="dxa"/>
+            <w:vAlign w:val="center"/>
+          </w:tcPr>
+          <w:p>
+            <w:pPr>
+              <w:spacing w:after="20"/>
+              <w:ind w:right="1"/>
+              <w:jc w:val="center"/>
+              <w:rPr>
+                <w:sz w:val="28"/>
+                <w:szCs w:val="28"/>
+                <w:lang w:val="en-US"/>
+              </w:rPr>
+            </w:pPr>
+            <w:r>
+              <w:rPr>
+                <w:bCs/>
+                <w:sz w:val="28"/>
+                <w:szCs w:val="28"/>
+              </w:rPr>
+              <w:t>{{ o.code }}</w:t>
+            </w:r>
+          </w:p>
+        </w:tc>
+        <w:tc>
+          <w:tcPr>
+            <w:tcW w:w="9246" w:type="dxa"/>
+            <w:gridSpan w:val="10"/>
+            <w:vAlign w:val="center"/>
+          </w:tcPr>
+          <w:p>
+            <w:pPr>
+              <w:spacing w:after="20" w:line="276" w:lineRule="auto"/>
+              <w:ind w:right="146"/>
+              <w:jc w:val="both"/>
+              <w:rPr>
+                <w:sz w:val="28"/>
+                <w:szCs w:val="28"/>
+              </w:rPr>
+            </w:pPr>
+            <w:r>
+              <w:rPr>
+                <w:sz w:val="28"/>
+              </w:rPr>
+              <w:t>{{ o.text }}</w:t>
+            </w:r>
+          </w:p>
+        </w:tc>
+      </w:tr>
+      <w:tr>
+        <w:tc>
+          <w:tcPr>
+            <w:tcW w:w="715" w:type="dxa"/>
+            <w:vAlign w:val="center"/>
+          </w:tcPr>
+          <w:p>
+            <w:pPr>
+              <w:spacing w:after="20"/>
+              <w:ind w:right="1"/>
+              <w:jc w:val="center"/>
+              <w:rPr>
+                <w:sz w:val="28"/>
+                <w:szCs w:val="28"/>
+                <w:lang w:val="en-US"/>
+              </w:rPr>
+            </w:pPr>
+            <w:r>
+              <w:rPr>
+                <w:bCs/>
+                <w:sz w:val="28"/>
+                <w:szCs w:val="28"/>
+              </w:rPr>
+              <w:t>{%tr endfor %}</w:t>
+            </w:r>
+          </w:p>
+        </w:tc>
+        <w:tc>
+          <w:tcPr>
+            <w:tcW w:w="9246" w:type="dxa"/>
+            <w:gridSpan w:val="10"/>
+            <w:vAlign w:val="center"/>
+          </w:tcPr>
+          <w:p>
+            <w:pPr>
+              <w:spacing w:after="20" w:line="276" w:lineRule="auto"/>
+              <w:ind w:right="146"/>
+              <w:jc w:val="both"/>
+              <w:rPr>
+                <w:sz w:val="28"/>
+                <w:szCs w:val="28"/>
+              </w:rPr>
+            </w:pPr>
+            <w:r>
+              <w:rPr>
+                <w:sz w:val="28"/>
+              </w:rPr>
+            </w:r>
+          </w:p>
+        </w:tc>
+      </w:tr>
+      <w:tr>
+        <w:tc>
+          <w:tcPr>
+            <w:tcW w:w="9961" w:type="dxa"/>
+            <w:gridSpan w:val="11"/>
             <w:tcBorders>
               <w:top w:val="single" w:sz="4" w:space="0" w:color="auto"/>
               <w:left w:val="nil"/>
@@ -2250,548 +2836,6 @@
           </w:tcPr>
           <w:p>
             <w:pPr>
-              <w:spacing w:after="20"/>
-              <w:ind w:right="146"/>
-              <w:jc w:val="center"/>
-              <w:rPr>
-                <w:b/>
-                <w:bCs/>
-                <w:sz w:val="16"/>
-                <w:szCs w:val="16"/>
-                <w:lang w:val="en-US"/>
-              </w:rPr>
-            </w:pPr>
-          </w:p>
-        </w:tc>
-        <w:tc>
-          <w:tcPr>
-            <w:tcW w:w="9246" w:type="dxa"/>
-            <w:gridSpan w:val="9"/>
-            <w:tcBorders>
-              <w:top w:val="single" w:sz="4" w:space="0" w:color="auto"/>
-              <w:left w:val="nil"/>
-              <w:bottom w:val="single" w:sz="4" w:space="0" w:color="auto"/>
-              <w:right w:val="nil"/>
-            </w:tcBorders>
-            <w:vAlign w:val="center"/>
-          </w:tcPr>
-          <w:p>
-            <w:pPr>
-              <w:spacing w:after="20"/>
-              <w:ind w:left="79" w:right="146"/>
-              <w:rPr>
-                <w:b/>
-                <w:bCs/>
-                <w:sz w:val="16"/>
-                <w:szCs w:val="16"/>
-              </w:rPr>
-            </w:pPr>
-          </w:p>
-        </w:tc>
-      </w:tr>
-      <w:tr>
-        <w:trPr>
-          <w:trHeight w:val="353"/>
-        </w:trPr>
-        <w:tc>
-          <w:tcPr>
-            <w:tcW w:w="715" w:type="dxa"/>
-            <w:tcBorders>
-              <w:top w:val="single" w:sz="4" w:space="0" w:color="auto"/>
-            </w:tcBorders>
-            <w:vAlign w:val="center"/>
-          </w:tcPr>
-          <w:p>
-            <w:pPr>
-              <w:spacing w:after="20"/>
-              <w:ind w:right="146"/>
-              <w:jc w:val="center"/>
-              <w:rPr>
-                <w:sz w:val="28"/>
-                <w:szCs w:val="28"/>
-              </w:rPr>
-            </w:pPr>
-            <w:r>
-              <w:rPr>
-                <w:b/>
-                <w:bCs/>
-                <w:sz w:val="28"/>
-                <w:szCs w:val="28"/>
-                <w:lang w:val="en-US"/>
-              </w:rPr>
-              <w:t>4</w:t>
-            </w:r>
-            <w:r>
-              <w:rPr>
-                <w:b/>
-                <w:bCs/>
-                <w:sz w:val="28"/>
-                <w:szCs w:val="28"/>
-              </w:rPr>
-              <w:t>.</w:t>
-            </w:r>
-          </w:p>
-        </w:tc>
-        <w:tc>
-          <w:tcPr>
-            <w:tcW w:w="9246" w:type="dxa"/>
-            <w:gridSpan w:val="9"/>
-            <w:tcBorders>
-              <w:top w:val="single" w:sz="4" w:space="0" w:color="auto"/>
-            </w:tcBorders>
-            <w:vAlign w:val="center"/>
-          </w:tcPr>
-          <w:p>
-            <w:pPr>
-              <w:spacing w:after="20"/>
-              <w:ind w:left="79" w:right="146"/>
-              <w:rPr>
-                <w:sz w:val="28"/>
-                <w:szCs w:val="28"/>
-              </w:rPr>
-            </w:pPr>
-            <w:r>
-              <w:rPr>
-                <w:b/>
-                <w:bCs/>
-                <w:sz w:val="28"/>
-                <w:szCs w:val="28"/>
-              </w:rPr>
-              <w:t>Ta</w:t>
-            </w:r>
-            <w:r>
-              <w:rPr>
-                <w:b/>
-                <w:sz w:val="28"/>
-                <w:lang w:val="en-US"/>
-              </w:rPr>
-              <w:t>’</w:t>
-            </w:r>
-            <w:r>
-              <w:rPr>
-                <w:b/>
-                <w:bCs/>
-                <w:sz w:val="28"/>
-                <w:szCs w:val="28"/>
-              </w:rPr>
-              <w:t>lim natijalari (TN)</w:t>
-            </w:r>
-          </w:p>
-        </w:tc>
-      </w:tr>
-      <w:tr>
-        <w:tc>
-          <w:tcPr>
-            <w:tcW w:w="715" w:type="dxa"/>
-            <w:vAlign w:val="center"/>
-          </w:tcPr>
-          <w:p>
-            <w:pPr>
-              <w:spacing w:after="20"/>
-              <w:ind w:right="146"/>
-              <w:rPr>
-                <w:sz w:val="28"/>
-                <w:szCs w:val="28"/>
-              </w:rPr>
-            </w:pPr>
-          </w:p>
-        </w:tc>
-        <w:tc>
-          <w:tcPr>
-            <w:tcW w:w="9246" w:type="dxa"/>
-            <w:gridSpan w:val="9"/>
-          </w:tcPr>
-          <w:p>
-            <w:pPr>
-              <w:ind w:left="121" w:right="146"/>
-              <w:rPr>
-                <w:sz w:val="28"/>
-                <w:szCs w:val="28"/>
-              </w:rPr>
-            </w:pPr>
-            <w:r>
-              <w:rPr>
-                <w:b/>
-                <w:bCs/>
-                <w:i/>
-                <w:iCs/>
-                <w:sz w:val="28"/>
-                <w:szCs w:val="28"/>
-              </w:rPr>
-              <w:t>Kasbiy kompetensiyalar:</w:t>
-            </w:r>
-          </w:p>
-        </w:tc>
-      </w:tr>
-      <w:tr>
-        <w:tc>
-          <w:tcPr>
-            <w:tcW w:w="715" w:type="dxa"/>
-            <w:vAlign w:val="center"/>
-          </w:tcPr>
-          <w:p>
-            <w:pPr>
-              <w:spacing w:after="20"/>
-              <w:ind w:right="1"/>
-              <w:jc w:val="center"/>
-              <w:rPr>
-                <w:sz w:val="28"/>
-                <w:szCs w:val="28"/>
-              </w:rPr>
-            </w:pPr>
-            <w:r>
-              <w:rPr>
-                <w:bCs/>
-                <w:sz w:val="28"/>
-                <w:szCs w:val="28"/>
-              </w:rPr>
-              <w:t>{%tr for o in outcomes.professional %}</w:t>
-            </w:r>
-          </w:p>
-        </w:tc>
-        <w:tc>
-          <w:tcPr>
-            <w:tcW w:w="9246" w:type="dxa"/>
-            <w:gridSpan w:val="9"/>
-            <w:vAlign w:val="center"/>
-          </w:tcPr>
-          <w:p>
-            <w:pPr>
-              <w:spacing w:after="20" w:line="276" w:lineRule="auto"/>
-              <w:ind w:right="146"/>
-              <w:jc w:val="both"/>
-              <w:rPr>
-                <w:sz w:val="28"/>
-                <w:szCs w:val="28"/>
-              </w:rPr>
-            </w:pPr>
-            <w:r>
-              <w:rPr>
-                <w:sz w:val="28"/>
-              </w:rPr>
-            </w:r>
-          </w:p>
-        </w:tc>
-      </w:tr>
-      <w:tr>
-        <w:tc>
-          <w:tcPr>
-            <w:tcW w:w="715" w:type="dxa"/>
-            <w:vAlign w:val="center"/>
-          </w:tcPr>
-          <w:p>
-            <w:pPr>
-              <w:spacing w:after="20"/>
-              <w:ind w:right="1"/>
-              <w:jc w:val="center"/>
-              <w:rPr>
-                <w:sz w:val="28"/>
-                <w:szCs w:val="28"/>
-              </w:rPr>
-            </w:pPr>
-            <w:r>
-              <w:rPr>
-                <w:bCs/>
-                <w:sz w:val="28"/>
-                <w:szCs w:val="28"/>
-              </w:rPr>
-              <w:t>{{ o.code }}</w:t>
-            </w:r>
-          </w:p>
-        </w:tc>
-        <w:tc>
-          <w:tcPr>
-            <w:tcW w:w="9246" w:type="dxa"/>
-            <w:gridSpan w:val="9"/>
-            <w:vAlign w:val="center"/>
-          </w:tcPr>
-          <w:p>
-            <w:pPr>
-              <w:spacing w:after="20" w:line="276" w:lineRule="auto"/>
-              <w:ind w:right="146"/>
-              <w:jc w:val="both"/>
-              <w:rPr>
-                <w:sz w:val="28"/>
-                <w:szCs w:val="28"/>
-              </w:rPr>
-            </w:pPr>
-            <w:r>
-              <w:rPr>
-                <w:sz w:val="28"/>
-              </w:rPr>
-              <w:t>{{ o.text }}</w:t>
-            </w:r>
-          </w:p>
-        </w:tc>
-      </w:tr>
-      <w:tr>
-        <w:tc>
-          <w:tcPr>
-            <w:tcW w:w="715" w:type="dxa"/>
-            <w:vAlign w:val="center"/>
-          </w:tcPr>
-          <w:p>
-            <w:pPr>
-              <w:spacing w:after="20"/>
-              <w:ind w:right="1"/>
-              <w:jc w:val="center"/>
-              <w:rPr>
-                <w:sz w:val="28"/>
-                <w:szCs w:val="28"/>
-              </w:rPr>
-            </w:pPr>
-            <w:r>
-              <w:rPr>
-                <w:bCs/>
-                <w:sz w:val="28"/>
-                <w:szCs w:val="28"/>
-              </w:rPr>
-              <w:t>{%tr endfor %}</w:t>
-            </w:r>
-          </w:p>
-        </w:tc>
-        <w:tc>
-          <w:tcPr>
-            <w:tcW w:w="9246" w:type="dxa"/>
-            <w:gridSpan w:val="9"/>
-            <w:vAlign w:val="center"/>
-          </w:tcPr>
-          <w:p>
-            <w:pPr>
-              <w:spacing w:after="20" w:line="276" w:lineRule="auto"/>
-              <w:ind w:right="146"/>
-              <w:jc w:val="both"/>
-              <w:rPr>
-                <w:sz w:val="28"/>
-                <w:szCs w:val="28"/>
-              </w:rPr>
-            </w:pPr>
-            <w:r>
-              <w:rPr>
-                <w:sz w:val="28"/>
-              </w:rPr>
-            </w:r>
-          </w:p>
-        </w:tc>
-      </w:tr>
-      <w:tr>
-        <w:trPr>
-          <w:trHeight w:val="382"/>
-        </w:trPr>
-        <w:tc>
-          <w:tcPr>
-            <w:tcW w:w="715" w:type="dxa"/>
-            <w:vAlign w:val="center"/>
-          </w:tcPr>
-          <w:p>
-            <w:pPr>
-              <w:spacing w:after="20"/>
-              <w:ind w:right="1"/>
-              <w:jc w:val="center"/>
-              <w:rPr>
-                <w:sz w:val="28"/>
-                <w:szCs w:val="28"/>
-                <w:lang w:val="en-US"/>
-              </w:rPr>
-            </w:pPr>
-          </w:p>
-        </w:tc>
-        <w:tc>
-          <w:tcPr>
-            <w:tcW w:w="9246" w:type="dxa"/>
-            <w:gridSpan w:val="9"/>
-          </w:tcPr>
-          <w:p>
-            <w:pPr>
-              <w:ind w:left="121" w:right="146"/>
-              <w:rPr>
-                <w:sz w:val="28"/>
-                <w:szCs w:val="28"/>
-              </w:rPr>
-            </w:pPr>
-            <w:r>
-              <w:rPr>
-                <w:b/>
-                <w:bCs/>
-                <w:i/>
-                <w:iCs/>
-                <w:sz w:val="28"/>
-                <w:szCs w:val="28"/>
-              </w:rPr>
-              <w:t>Ko‘nikmalar:</w:t>
-            </w:r>
-          </w:p>
-        </w:tc>
-      </w:tr>
-      <w:tr>
-        <w:tc>
-          <w:tcPr>
-            <w:tcW w:w="715" w:type="dxa"/>
-            <w:vAlign w:val="center"/>
-          </w:tcPr>
-          <w:p>
-            <w:pPr>
-              <w:spacing w:after="20"/>
-              <w:ind w:right="1"/>
-              <w:jc w:val="center"/>
-              <w:rPr>
-                <w:sz w:val="28"/>
-                <w:szCs w:val="28"/>
-                <w:lang w:val="en-US"/>
-              </w:rPr>
-            </w:pPr>
-            <w:r>
-              <w:rPr>
-                <w:bCs/>
-                <w:sz w:val="28"/>
-                <w:szCs w:val="28"/>
-              </w:rPr>
-              <w:t>{%tr for o in outcomes.skills %}</w:t>
-            </w:r>
-          </w:p>
-        </w:tc>
-        <w:tc>
-          <w:tcPr>
-            <w:tcW w:w="9246" w:type="dxa"/>
-            <w:gridSpan w:val="9"/>
-            <w:vAlign w:val="center"/>
-          </w:tcPr>
-          <w:p>
-            <w:pPr>
-              <w:spacing w:after="20" w:line="276" w:lineRule="auto"/>
-              <w:ind w:right="146"/>
-              <w:jc w:val="both"/>
-              <w:rPr>
-                <w:sz w:val="28"/>
-                <w:szCs w:val="28"/>
-              </w:rPr>
-            </w:pPr>
-            <w:r>
-              <w:rPr>
-                <w:sz w:val="28"/>
-              </w:rPr>
-            </w:r>
-          </w:p>
-        </w:tc>
-      </w:tr>
-      <w:tr>
-        <w:tc>
-          <w:tcPr>
-            <w:tcW w:w="715" w:type="dxa"/>
-            <w:vAlign w:val="center"/>
-          </w:tcPr>
-          <w:p>
-            <w:pPr>
-              <w:spacing w:after="20"/>
-              <w:ind w:right="1"/>
-              <w:jc w:val="center"/>
-              <w:rPr>
-                <w:sz w:val="28"/>
-                <w:szCs w:val="28"/>
-                <w:lang w:val="en-US"/>
-              </w:rPr>
-            </w:pPr>
-            <w:r>
-              <w:rPr>
-                <w:bCs/>
-                <w:sz w:val="28"/>
-                <w:szCs w:val="28"/>
-              </w:rPr>
-              <w:t>{{ o.code }}</w:t>
-            </w:r>
-          </w:p>
-        </w:tc>
-        <w:tc>
-          <w:tcPr>
-            <w:tcW w:w="9246" w:type="dxa"/>
-            <w:gridSpan w:val="9"/>
-            <w:vAlign w:val="center"/>
-          </w:tcPr>
-          <w:p>
-            <w:pPr>
-              <w:spacing w:after="20" w:line="276" w:lineRule="auto"/>
-              <w:ind w:right="146"/>
-              <w:jc w:val="both"/>
-              <w:rPr>
-                <w:sz w:val="28"/>
-                <w:szCs w:val="28"/>
-              </w:rPr>
-            </w:pPr>
-            <w:r>
-              <w:rPr>
-                <w:sz w:val="28"/>
-              </w:rPr>
-              <w:t>{{ o.text }}</w:t>
-            </w:r>
-          </w:p>
-        </w:tc>
-      </w:tr>
-      <w:tr>
-        <w:tc>
-          <w:tcPr>
-            <w:tcW w:w="715" w:type="dxa"/>
-            <w:vAlign w:val="center"/>
-          </w:tcPr>
-          <w:p>
-            <w:pPr>
-              <w:spacing w:after="20"/>
-              <w:ind w:right="1"/>
-              <w:jc w:val="center"/>
-              <w:rPr>
-                <w:sz w:val="28"/>
-                <w:szCs w:val="28"/>
-                <w:lang w:val="en-US"/>
-              </w:rPr>
-            </w:pPr>
-            <w:r>
-              <w:rPr>
-                <w:bCs/>
-                <w:sz w:val="28"/>
-                <w:szCs w:val="28"/>
-              </w:rPr>
-              <w:t>{%tr endfor %}</w:t>
-            </w:r>
-          </w:p>
-        </w:tc>
-        <w:tc>
-          <w:tcPr>
-            <w:tcW w:w="9246" w:type="dxa"/>
-            <w:gridSpan w:val="9"/>
-            <w:vAlign w:val="center"/>
-          </w:tcPr>
-          <w:p>
-            <w:pPr>
-              <w:spacing w:after="20" w:line="276" w:lineRule="auto"/>
-              <w:ind w:right="146"/>
-              <w:jc w:val="both"/>
-              <w:rPr>
-                <w:sz w:val="28"/>
-                <w:szCs w:val="28"/>
-              </w:rPr>
-            </w:pPr>
-            <w:r>
-              <w:rPr>
-                <w:sz w:val="28"/>
-              </w:rPr>
-            </w:r>
-          </w:p>
-        </w:tc>
-      </w:tr>
-      <w:tr>
-        <w:tc>
-          <w:tcPr>
-            <w:tcW w:w="9961" w:type="dxa"/>
-            <w:gridSpan w:val="10"/>
-            <w:tcBorders>
-              <w:top w:val="single" w:sz="4" w:space="0" w:color="auto"/>
-              <w:left w:val="nil"/>
-              <w:bottom w:val="single" w:sz="4" w:space="0" w:color="auto"/>
-              <w:right w:val="nil"/>
-            </w:tcBorders>
-            <w:vAlign w:val="center"/>
-          </w:tcPr>
-          <w:p>
-            <w:pPr>
               <w:spacing w:after="20" w:line="276" w:lineRule="auto"/>
               <w:ind w:right="146"/>
               <w:jc w:val="both"/>
@@ -2850,7 +2894,7 @@
         <w:tc>
           <w:tcPr>
             <w:tcW w:w="8551" w:type="dxa"/>
-            <w:gridSpan w:val="8"/>
+            <w:gridSpan w:val="9"/>
             <w:tcBorders>
               <w:top w:val="single" w:sz="4" w:space="0" w:color="auto"/>
             </w:tcBorders>
@@ -2930,7 +2974,7 @@
         <w:tc>
           <w:tcPr>
             <w:tcW w:w="8551" w:type="dxa"/>
-            <w:gridSpan w:val="8"/>
+            <w:gridSpan w:val="9"/>
             <w:vAlign w:val="center"/>
           </w:tcPr>
           <w:p>
@@ -3033,7 +3077,7 @@
         <w:tc>
           <w:tcPr>
             <w:tcW w:w="8551" w:type="dxa"/>
-            <w:gridSpan w:val="8"/>
+            <w:gridSpan w:val="9"/>
             <w:shd w:val="clear" w:color="auto" w:fill="auto"/>
             <w:vAlign w:val="center"/>
           </w:tcPr>
@@ -3113,7 +3157,7 @@
         <w:tc>
           <w:tcPr>
             <w:tcW w:w="8551" w:type="dxa"/>
-            <w:gridSpan w:val="8"/>
+            <w:gridSpan w:val="9"/>
             <w:shd w:val="clear" w:color="auto" w:fill="auto"/>
             <w:vAlign w:val="center"/>
           </w:tcPr>
@@ -3195,7 +3239,7 @@
         <w:tc>
           <w:tcPr>
             <w:tcW w:w="8551" w:type="dxa"/>
-            <w:gridSpan w:val="8"/>
+            <w:gridSpan w:val="9"/>
             <w:shd w:val="clear" w:color="auto" w:fill="auto"/>
             <w:vAlign w:val="center"/>
           </w:tcPr>
@@ -3264,7 +3308,7 @@
         <w:tc>
           <w:tcPr>
             <w:tcW w:w="8551" w:type="dxa"/>
-            <w:gridSpan w:val="8"/>
+            <w:gridSpan w:val="9"/>
           </w:tcPr>
           <w:p>
             <w:pPr>
@@ -3367,7 +3411,7 @@
         <w:tc>
           <w:tcPr>
             <w:tcW w:w="8551" w:type="dxa"/>
-            <w:gridSpan w:val="8"/>
+            <w:gridSpan w:val="9"/>
             <w:shd w:val="clear" w:color="auto" w:fill="auto"/>
             <w:vAlign w:val="center"/>
           </w:tcPr>
@@ -3448,7 +3492,7 @@
         <w:tc>
           <w:tcPr>
             <w:tcW w:w="8551" w:type="dxa"/>
-            <w:gridSpan w:val="8"/>
+            <w:gridSpan w:val="9"/>
             <w:shd w:val="clear" w:color="auto" w:fill="auto"/>
             <w:vAlign w:val="center"/>
           </w:tcPr>
@@ -3531,7 +3575,7 @@
         <w:tc>
           <w:tcPr>
             <w:tcW w:w="8551" w:type="dxa"/>
-            <w:gridSpan w:val="8"/>
+            <w:gridSpan w:val="9"/>
             <w:shd w:val="clear" w:color="auto" w:fill="auto"/>
             <w:vAlign w:val="center"/>
           </w:tcPr>
@@ -3608,7 +3652,7 @@
         <w:tc>
           <w:tcPr>
             <w:tcW w:w="8551" w:type="dxa"/>
-            <w:gridSpan w:val="8"/>
+            <w:gridSpan w:val="9"/>
             <w:shd w:val="clear" w:color="auto" w:fill="auto"/>
             <w:vAlign w:val="center"/>
           </w:tcPr>
@@ -3705,7 +3749,7 @@
         <w:tc>
           <w:tcPr>
             <w:tcW w:w="8551" w:type="dxa"/>
-            <w:gridSpan w:val="8"/>
+            <w:gridSpan w:val="9"/>
             <w:shd w:val="clear" w:color="auto" w:fill="auto"/>
             <w:vAlign w:val="center"/>
           </w:tcPr>
@@ -3799,7 +3843,7 @@
         <w:tc>
           <w:tcPr>
             <w:tcW w:w="8551" w:type="dxa"/>
-            <w:gridSpan w:val="8"/>
+            <w:gridSpan w:val="9"/>
             <w:shd w:val="clear" w:color="auto" w:fill="auto"/>
             <w:vAlign w:val="center"/>
           </w:tcPr>
@@ -3895,7 +3939,386 @@
         <w:tc>
           <w:tcPr>
             <w:tcW w:w="8551" w:type="dxa"/>
-            <w:gridSpan w:val="8"/>
+            <w:gridSpan w:val="9"/>
+            <w:shd w:val="clear" w:color="auto" w:fill="auto"/>
+            <w:vAlign w:val="center"/>
+          </w:tcPr>
+          <w:p>
+            <w:pPr>
+              <w:spacing w:after="20"/>
+              <w:ind w:left="121" w:right="146"/>
+              <w:jc w:val="both"/>
+              <w:rPr>
+                <w:b/>
+                <w:bCs/>
+                <w:sz w:val="28"/>
+                <w:szCs w:val="28"/>
+                <w:lang w:val="en-US"/>
+              </w:rPr>
+            </w:pPr>
+            <w:r>
+              <w:rPr>
+                <w:sz w:val="28"/>
+                <w:lang w:val="en-US"/>
+              </w:rPr>
+            </w:r>
+          </w:p>
+        </w:tc>
+        <w:tc>
+          <w:tcPr>
+            <w:tcW w:w="695" w:type="dxa"/>
+            <w:shd w:val="clear" w:color="auto" w:fill="auto"/>
+            <w:vAlign w:val="center"/>
+          </w:tcPr>
+          <w:p>
+            <w:pPr>
+              <w:spacing w:after="20"/>
+              <w:ind w:right="146"/>
+              <w:jc w:val="center"/>
+              <w:rPr>
+                <w:b/>
+                <w:bCs/>
+                <w:sz w:val="28"/>
+                <w:szCs w:val="28"/>
+                <w:lang w:val="en-US"/>
+              </w:rPr>
+            </w:pPr>
+            <w:r>
+              <w:rPr>
+                <w:b/>
+                <w:bCs/>
+                <w:sz w:val="28"/>
+                <w:szCs w:val="28"/>
+                <w:lang w:val="en-US"/>
+              </w:rPr>
+            </w:r>
+          </w:p>
+        </w:tc>
+      </w:tr>
+      <w:tr>
+        <w:trPr>
+          <w:trHeight w:val="434"/>
+        </w:trPr>
+        <w:tc>
+          <w:tcPr>
+            <w:tcW w:w="715" w:type="dxa"/>
+            <w:shd w:val="clear" w:color="auto" w:fill="auto"/>
+            <w:vAlign w:val="center"/>
+          </w:tcPr>
+          <w:p>
+            <w:pPr>
+              <w:spacing w:after="20"/>
+              <w:ind w:right="1"/>
+              <w:jc w:val="center"/>
+              <w:rPr>
+                <w:b/>
+                <w:bCs/>
+                <w:sz w:val="28"/>
+                <w:szCs w:val="28"/>
+                <w:lang w:val="en-US"/>
+              </w:rPr>
+            </w:pPr>
+            <w:r>
+              <w:rPr>
+                <w:b/>
+                <w:bCs/>
+                <w:sz w:val="28"/>
+                <w:szCs w:val="28"/>
+                <w:lang w:val="en-US"/>
+              </w:rPr>
+            </w:r>
+          </w:p>
+        </w:tc>
+        <w:tc>
+          <w:tcPr>
+            <w:tcW w:w="8551" w:type="dxa"/>
+            <w:gridSpan w:val="9"/>
+            <w:shd w:val="clear" w:color="auto" w:fill="auto"/>
+            <w:vAlign w:val="center"/>
+          </w:tcPr>
+          <w:p>
+            <w:pPr>
+              <w:spacing w:after="20"/>
+              <w:ind w:left="121" w:right="146"/>
+              <w:jc w:val="both"/>
+              <w:rPr>
+                <w:b/>
+                <w:bCs/>
+                <w:sz w:val="28"/>
+                <w:szCs w:val="28"/>
+                <w:lang w:val="en-US"/>
+              </w:rPr>
+            </w:pPr>
+            <w:r>
+              <w:rPr>
+                <w:sz w:val="28"/>
+                <w:lang w:val="en-US"/>
+              </w:rPr>
+              <w:t>Seminar (S)</w:t>
+            </w:r>
+          </w:p>
+        </w:tc>
+        <w:tc>
+          <w:tcPr>
+            <w:tcW w:w="695" w:type="dxa"/>
+            <w:shd w:val="clear" w:color="auto" w:fill="auto"/>
+            <w:vAlign w:val="center"/>
+          </w:tcPr>
+          <w:p>
+            <w:pPr>
+              <w:spacing w:after="20"/>
+              <w:ind w:right="146"/>
+              <w:jc w:val="center"/>
+              <w:rPr>
+                <w:b/>
+                <w:bCs/>
+                <w:sz w:val="28"/>
+                <w:szCs w:val="28"/>
+                <w:lang w:val="en-US"/>
+              </w:rPr>
+            </w:pPr>
+            <w:r>
+              <w:rPr>
+                <w:b/>
+                <w:bCs/>
+                <w:sz w:val="28"/>
+                <w:szCs w:val="28"/>
+                <w:lang w:val="en-US"/>
+              </w:rPr>
+              <w:t>{{ hours.seminar }}</w:t>
+            </w:r>
+          </w:p>
+        </w:tc>
+      </w:tr>
+      <w:tr>
+        <w:trPr>
+          <w:trHeight w:val="434"/>
+        </w:trPr>
+        <w:tc>
+          <w:tcPr>
+            <w:tcW w:w="715" w:type="dxa"/>
+            <w:shd w:val="clear" w:color="auto" w:fill="auto"/>
+            <w:vAlign w:val="center"/>
+          </w:tcPr>
+          <w:p>
+            <w:pPr>
+              <w:spacing w:after="20"/>
+              <w:ind w:right="1"/>
+              <w:jc w:val="center"/>
+              <w:rPr>
+                <w:b/>
+                <w:bCs/>
+                <w:sz w:val="28"/>
+                <w:szCs w:val="28"/>
+                <w:lang w:val="en-US"/>
+              </w:rPr>
+            </w:pPr>
+            <w:r>
+              <w:rPr>
+                <w:b/>
+                <w:bCs/>
+                <w:sz w:val="28"/>
+                <w:szCs w:val="28"/>
+                <w:lang w:val="en-US"/>
+              </w:rPr>
+              <w:t>{%tr for t in seminars %}</w:t>
+            </w:r>
+          </w:p>
+        </w:tc>
+        <w:tc>
+          <w:tcPr>
+            <w:tcW w:w="8551" w:type="dxa"/>
+            <w:gridSpan w:val="9"/>
+            <w:shd w:val="clear" w:color="auto" w:fill="auto"/>
+            <w:vAlign w:val="center"/>
+          </w:tcPr>
+          <w:p>
+            <w:pPr>
+              <w:spacing w:after="20"/>
+              <w:ind w:left="121" w:right="146"/>
+              <w:jc w:val="both"/>
+              <w:rPr>
+                <w:b/>
+                <w:bCs/>
+                <w:sz w:val="28"/>
+                <w:szCs w:val="28"/>
+                <w:lang w:val="en-US"/>
+              </w:rPr>
+            </w:pPr>
+            <w:r>
+              <w:rPr>
+                <w:sz w:val="28"/>
+                <w:lang w:val="en-US"/>
+              </w:rPr>
+            </w:r>
+          </w:p>
+        </w:tc>
+        <w:tc>
+          <w:tcPr>
+            <w:tcW w:w="695" w:type="dxa"/>
+            <w:shd w:val="clear" w:color="auto" w:fill="auto"/>
+            <w:vAlign w:val="center"/>
+          </w:tcPr>
+          <w:p>
+            <w:pPr>
+              <w:spacing w:after="20"/>
+              <w:ind w:right="146"/>
+              <w:jc w:val="center"/>
+              <w:rPr>
+                <w:b/>
+                <w:bCs/>
+                <w:sz w:val="28"/>
+                <w:szCs w:val="28"/>
+                <w:lang w:val="en-US"/>
+              </w:rPr>
+            </w:pPr>
+            <w:r>
+              <w:rPr>
+                <w:b/>
+                <w:bCs/>
+                <w:sz w:val="28"/>
+                <w:szCs w:val="28"/>
+                <w:lang w:val="en-US"/>
+              </w:rPr>
+            </w:r>
+          </w:p>
+        </w:tc>
+      </w:tr>
+      <w:tr>
+        <w:trPr>
+          <w:trHeight w:val="434"/>
+        </w:trPr>
+        <w:tc>
+          <w:tcPr>
+            <w:tcW w:w="715" w:type="dxa"/>
+            <w:shd w:val="clear" w:color="auto" w:fill="auto"/>
+            <w:vAlign w:val="center"/>
+          </w:tcPr>
+          <w:p>
+            <w:pPr>
+              <w:spacing w:after="20"/>
+              <w:ind w:right="1"/>
+              <w:jc w:val="center"/>
+              <w:rPr>
+                <w:b/>
+                <w:bCs/>
+                <w:sz w:val="28"/>
+                <w:szCs w:val="28"/>
+                <w:lang w:val="en-US"/>
+              </w:rPr>
+            </w:pPr>
+            <w:r>
+              <w:rPr>
+                <w:b/>
+                <w:bCs/>
+                <w:sz w:val="28"/>
+                <w:szCs w:val="28"/>
+                <w:lang w:val="en-US"/>
+              </w:rPr>
+              <w:t>{{ t.code }}</w:t>
+            </w:r>
+          </w:p>
+        </w:tc>
+        <w:tc>
+          <w:tcPr>
+            <w:tcW w:w="8551" w:type="dxa"/>
+            <w:gridSpan w:val="9"/>
+            <w:shd w:val="clear" w:color="auto" w:fill="auto"/>
+            <w:vAlign w:val="center"/>
+          </w:tcPr>
+          <w:p>
+            <w:pPr>
+              <w:spacing w:after="20"/>
+              <w:ind w:left="121" w:right="146"/>
+              <w:jc w:val="both"/>
+              <w:rPr>
+                <w:b/>
+                <w:bCs/>
+                <w:sz w:val="28"/>
+                <w:szCs w:val="28"/>
+                <w:lang w:val="en-US"/>
+              </w:rPr>
+            </w:pPr>
+            <w:r>
+              <w:rPr>
+                <w:sz w:val="28"/>
+                <w:lang w:val="en-US"/>
+              </w:rPr>
+              <w:t>{{ t.title }}</w:t>
+            </w:r>
+          </w:p>
+        </w:tc>
+        <w:tc>
+          <w:tcPr>
+            <w:tcW w:w="695" w:type="dxa"/>
+            <w:shd w:val="clear" w:color="auto" w:fill="auto"/>
+            <w:vAlign w:val="center"/>
+          </w:tcPr>
+          <w:p>
+            <w:pPr>
+              <w:spacing w:after="20"/>
+              <w:ind w:right="146"/>
+              <w:jc w:val="center"/>
+              <w:rPr>
+                <w:b/>
+                <w:bCs/>
+                <w:sz w:val="28"/>
+                <w:szCs w:val="28"/>
+                <w:lang w:val="en-US"/>
+              </w:rPr>
+            </w:pPr>
+            <w:r>
+              <w:rPr>
+                <w:b/>
+                <w:bCs/>
+                <w:sz w:val="28"/>
+                <w:szCs w:val="28"/>
+                <w:lang w:val="en-US"/>
+              </w:rPr>
+              <w:t>{{ t.hours }}</w:t>
+            </w:r>
+          </w:p>
+        </w:tc>
+      </w:tr>
+      <w:tr>
+        <w:trPr>
+          <w:trHeight w:val="434"/>
+        </w:trPr>
+        <w:tc>
+          <w:tcPr>
+            <w:tcW w:w="715" w:type="dxa"/>
+            <w:shd w:val="clear" w:color="auto" w:fill="auto"/>
+            <w:vAlign w:val="center"/>
+          </w:tcPr>
+          <w:p>
+            <w:pPr>
+              <w:spacing w:after="20"/>
+              <w:ind w:right="1"/>
+              <w:jc w:val="center"/>
+              <w:rPr>
+                <w:b/>
+                <w:bCs/>
+                <w:sz w:val="28"/>
+                <w:szCs w:val="28"/>
+                <w:lang w:val="en-US"/>
+              </w:rPr>
+            </w:pPr>
+            <w:r>
+              <w:rPr>
+                <w:b/>
+                <w:bCs/>
+                <w:sz w:val="28"/>
+                <w:szCs w:val="28"/>
+                <w:lang w:val="en-US"/>
+              </w:rPr>
+              <w:t>{%tr endfor %}</w:t>
+            </w:r>
+          </w:p>
+        </w:tc>
+        <w:tc>
+          <w:tcPr>
+            <w:tcW w:w="8551" w:type="dxa"/>
+            <w:gridSpan w:val="9"/>
             <w:shd w:val="clear" w:color="auto" w:fill="auto"/>
             <w:vAlign w:val="center"/>
           </w:tcPr>
@@ -3958,7 +4381,7 @@
         <w:tc>
           <w:tcPr>
             <w:tcW w:w="9961" w:type="dxa"/>
-            <w:gridSpan w:val="10"/>
+            <w:gridSpan w:val="11"/>
             <w:tcBorders>
               <w:top w:val="single" w:sz="4" w:space="0" w:color="auto"/>
               <w:left w:val="nil"/>
@@ -4031,7 +4454,7 @@
         <w:tc>
           <w:tcPr>
             <w:tcW w:w="8551" w:type="dxa"/>
-            <w:gridSpan w:val="8"/>
+            <w:gridSpan w:val="9"/>
             <w:tcBorders>
               <w:top w:val="single" w:sz="4" w:space="0" w:color="auto"/>
             </w:tcBorders>
@@ -4133,7 +4556,7 @@
         <w:tc>
           <w:tcPr>
             <w:tcW w:w="8551" w:type="dxa"/>
-            <w:gridSpan w:val="8"/>
+            <w:gridSpan w:val="9"/>
             <w:shd w:val="clear" w:color="auto" w:fill="auto"/>
             <w:vAlign w:val="center"/>
           </w:tcPr>
@@ -4206,7 +4629,7 @@
         <w:tc>
           <w:tcPr>
             <w:tcW w:w="8551" w:type="dxa"/>
-            <w:gridSpan w:val="8"/>
+            <w:gridSpan w:val="9"/>
             <w:shd w:val="clear" w:color="auto" w:fill="auto"/>
             <w:vAlign w:val="center"/>
           </w:tcPr>
@@ -4281,7 +4704,7 @@
         <w:tc>
           <w:tcPr>
             <w:tcW w:w="8551" w:type="dxa"/>
-            <w:gridSpan w:val="8"/>
+            <w:gridSpan w:val="9"/>
             <w:shd w:val="clear" w:color="auto" w:fill="auto"/>
             <w:vAlign w:val="center"/>
           </w:tcPr>

</xml_diff>